<commit_message>
GAS implementation and tests, partially completed
</commit_message>
<xml_diff>
--- a/Trainign Docs/Other/usefull links.docx
+++ b/Trainign Docs/Other/usefull links.docx
@@ -38,29 +38,16 @@
         </w:rPr>
       </w:pPr>
       <w:hyperlink r:id="rId5" w:history="1">
-        <w:proofErr w:type="spellStart"/>
-        <w:r>
-          <w:rPr>
-            <w:rFonts w:ascii="Calibri" w:eastAsia="Times New Roman" w:hAnsi="Calibri" w:cs="Calibri"/>
-            <w:color w:val="0000FF"/>
-            <w:kern w:val="0"/>
-            <w:u w:val="single"/>
-            <w:lang w:eastAsia="en-GB"/>
-            <w14:ligatures w14:val="none"/>
-          </w:rPr>
-          <w:t>electronicarts</w:t>
-        </w:r>
-        <w:proofErr w:type="spellEnd"/>
-        <w:r>
-          <w:rPr>
-            <w:rFonts w:ascii="Calibri" w:eastAsia="Times New Roman" w:hAnsi="Calibri" w:cs="Calibri"/>
-            <w:color w:val="0000FF"/>
-            <w:kern w:val="0"/>
-            <w:u w:val="single"/>
-            <w:lang w:eastAsia="en-GB"/>
-            <w14:ligatures w14:val="none"/>
-          </w:rPr>
-          <w:t>/IRIS: EA’s photosensitivity analysis tool (github.com)</w:t>
+        <w:r>
+          <w:rPr>
+            <w:rFonts w:ascii="Calibri" w:eastAsia="Times New Roman" w:hAnsi="Calibri" w:cs="Calibri"/>
+            <w:color w:val="0000FF"/>
+            <w:kern w:val="0"/>
+            <w:u w:val="single"/>
+            <w:lang w:eastAsia="en-GB"/>
+            <w14:ligatures w14:val="none"/>
+          </w:rPr>
+          <w:t>electronicarts/IRIS: EA’s photosensitivity analysis tool (github.com)</w:t>
         </w:r>
       </w:hyperlink>
     </w:p>
@@ -80,77 +67,16 @@
         </w:rPr>
       </w:pPr>
       <w:hyperlink r:id="rId6" w:history="1">
-        <w:proofErr w:type="spellStart"/>
-        <w:r>
-          <w:rPr>
-            <w:rFonts w:ascii="Calibri" w:eastAsia="Times New Roman" w:hAnsi="Calibri" w:cs="Calibri"/>
-            <w:color w:val="0000FF"/>
-            <w:kern w:val="0"/>
-            <w:u w:val="single"/>
-            <w:lang w:eastAsia="en-GB"/>
-            <w14:ligatures w14:val="none"/>
-          </w:rPr>
-          <w:t>electronicarts</w:t>
-        </w:r>
-        <w:proofErr w:type="spellEnd"/>
-        <w:r>
-          <w:rPr>
-            <w:rFonts w:ascii="Calibri" w:eastAsia="Times New Roman" w:hAnsi="Calibri" w:cs="Calibri"/>
-            <w:color w:val="0000FF"/>
-            <w:kern w:val="0"/>
-            <w:u w:val="single"/>
-            <w:lang w:eastAsia="en-GB"/>
-            <w14:ligatures w14:val="none"/>
-          </w:rPr>
-          <w:t>/</w:t>
-        </w:r>
-        <w:proofErr w:type="spellStart"/>
-        <w:r>
-          <w:rPr>
-            <w:rFonts w:ascii="Calibri" w:eastAsia="Times New Roman" w:hAnsi="Calibri" w:cs="Calibri"/>
-            <w:color w:val="0000FF"/>
-            <w:kern w:val="0"/>
-            <w:u w:val="single"/>
-            <w:lang w:eastAsia="en-GB"/>
-            <w14:ligatures w14:val="none"/>
-          </w:rPr>
-          <w:t>fonttik</w:t>
-        </w:r>
-        <w:proofErr w:type="spellEnd"/>
-        <w:r>
-          <w:rPr>
-            <w:rFonts w:ascii="Calibri" w:eastAsia="Times New Roman" w:hAnsi="Calibri" w:cs="Calibri"/>
-            <w:color w:val="0000FF"/>
-            <w:kern w:val="0"/>
-            <w:u w:val="single"/>
-            <w:lang w:eastAsia="en-GB"/>
-            <w14:ligatures w14:val="none"/>
-          </w:rPr>
-          <w:t xml:space="preserve">: </w:t>
-        </w:r>
-        <w:proofErr w:type="spellStart"/>
-        <w:r>
-          <w:rPr>
-            <w:rFonts w:ascii="Calibri" w:eastAsia="Times New Roman" w:hAnsi="Calibri" w:cs="Calibri"/>
-            <w:color w:val="0000FF"/>
-            <w:kern w:val="0"/>
-            <w:u w:val="single"/>
-            <w:lang w:eastAsia="en-GB"/>
-            <w14:ligatures w14:val="none"/>
-          </w:rPr>
-          <w:t>Fonttik</w:t>
-        </w:r>
-        <w:proofErr w:type="spellEnd"/>
-        <w:r>
-          <w:rPr>
-            <w:rFonts w:ascii="Calibri" w:eastAsia="Times New Roman" w:hAnsi="Calibri" w:cs="Calibri"/>
-            <w:color w:val="0000FF"/>
-            <w:kern w:val="0"/>
-            <w:u w:val="single"/>
-            <w:lang w:eastAsia="en-GB"/>
-            <w14:ligatures w14:val="none"/>
-          </w:rPr>
-          <w:t xml:space="preserve"> is a text size &amp; contrast checking solution created by EACC Tech to check accessibility criteria regarding text readability (github.com)</w:t>
+        <w:r>
+          <w:rPr>
+            <w:rFonts w:ascii="Calibri" w:eastAsia="Times New Roman" w:hAnsi="Calibri" w:cs="Calibri"/>
+            <w:color w:val="0000FF"/>
+            <w:kern w:val="0"/>
+            <w:u w:val="single"/>
+            <w:lang w:eastAsia="en-GB"/>
+            <w14:ligatures w14:val="none"/>
+          </w:rPr>
+          <w:t>electronicarts/fonttik: Fonttik is a text size &amp; contrast checking solution created by EACC Tech to check accessibility criteria regarding text readability (github.com)</w:t>
         </w:r>
       </w:hyperlink>
     </w:p>
@@ -170,29 +96,16 @@
         </w:rPr>
       </w:pPr>
       <w:hyperlink r:id="rId7" w:history="1">
-        <w:proofErr w:type="spellStart"/>
-        <w:r>
-          <w:rPr>
-            <w:rFonts w:ascii="Calibri" w:eastAsia="Times New Roman" w:hAnsi="Calibri" w:cs="Calibri"/>
-            <w:color w:val="0000FF"/>
-            <w:kern w:val="0"/>
-            <w:u w:val="single"/>
-            <w:lang w:eastAsia="en-GB"/>
-            <w14:ligatures w14:val="none"/>
-          </w:rPr>
-          <w:t>Qualicon</w:t>
-        </w:r>
-        <w:proofErr w:type="spellEnd"/>
-        <w:r>
-          <w:rPr>
-            <w:rFonts w:ascii="Calibri" w:eastAsia="Times New Roman" w:hAnsi="Calibri" w:cs="Calibri"/>
-            <w:color w:val="0000FF"/>
-            <w:kern w:val="0"/>
-            <w:u w:val="single"/>
-            <w:lang w:eastAsia="en-GB"/>
-            <w14:ligatures w14:val="none"/>
-          </w:rPr>
-          <w:t xml:space="preserve"> - Game Quality</w:t>
+        <w:r>
+          <w:rPr>
+            <w:rFonts w:ascii="Calibri" w:eastAsia="Times New Roman" w:hAnsi="Calibri" w:cs="Calibri"/>
+            <w:color w:val="0000FF"/>
+            <w:kern w:val="0"/>
+            <w:u w:val="single"/>
+            <w:lang w:eastAsia="en-GB"/>
+            <w14:ligatures w14:val="none"/>
+          </w:rPr>
+          <w:t>Qualicon - Game Quality</w:t>
         </w:r>
       </w:hyperlink>
       <w:r>
@@ -279,53 +192,16 @@
         </w:rPr>
       </w:pPr>
       <w:hyperlink r:id="rId10" w:history="1">
-        <w:proofErr w:type="spellStart"/>
-        <w:r>
-          <w:rPr>
-            <w:rFonts w:ascii="Calibri" w:eastAsia="Times New Roman" w:hAnsi="Calibri" w:cs="Calibri"/>
-            <w:color w:val="0000FF"/>
-            <w:kern w:val="0"/>
-            <w:u w:val="single"/>
-            <w:lang w:eastAsia="en-GB"/>
-            <w14:ligatures w14:val="none"/>
-          </w:rPr>
-          <w:t>microsoft</w:t>
-        </w:r>
-        <w:proofErr w:type="spellEnd"/>
-        <w:r>
-          <w:rPr>
-            <w:rFonts w:ascii="Calibri" w:eastAsia="Times New Roman" w:hAnsi="Calibri" w:cs="Calibri"/>
-            <w:color w:val="0000FF"/>
-            <w:kern w:val="0"/>
-            <w:u w:val="single"/>
-            <w:lang w:eastAsia="en-GB"/>
-            <w14:ligatures w14:val="none"/>
-          </w:rPr>
-          <w:t xml:space="preserve">/playwright: Playwright is a framework for Web Testing and Automation. It allows testing Chromium, Firefox and </w:t>
-        </w:r>
-        <w:proofErr w:type="spellStart"/>
-        <w:r>
-          <w:rPr>
-            <w:rFonts w:ascii="Calibri" w:eastAsia="Times New Roman" w:hAnsi="Calibri" w:cs="Calibri"/>
-            <w:color w:val="0000FF"/>
-            <w:kern w:val="0"/>
-            <w:u w:val="single"/>
-            <w:lang w:eastAsia="en-GB"/>
-            <w14:ligatures w14:val="none"/>
-          </w:rPr>
-          <w:t>WebKit</w:t>
-        </w:r>
-        <w:proofErr w:type="spellEnd"/>
-        <w:r>
-          <w:rPr>
-            <w:rFonts w:ascii="Calibri" w:eastAsia="Times New Roman" w:hAnsi="Calibri" w:cs="Calibri"/>
-            <w:color w:val="0000FF"/>
-            <w:kern w:val="0"/>
-            <w:u w:val="single"/>
-            <w:lang w:eastAsia="en-GB"/>
-            <w14:ligatures w14:val="none"/>
-          </w:rPr>
-          <w:t xml:space="preserve"> with a single API. (github.com)</w:t>
+        <w:r>
+          <w:rPr>
+            <w:rFonts w:ascii="Calibri" w:eastAsia="Times New Roman" w:hAnsi="Calibri" w:cs="Calibri"/>
+            <w:color w:val="0000FF"/>
+            <w:kern w:val="0"/>
+            <w:u w:val="single"/>
+            <w:lang w:eastAsia="en-GB"/>
+            <w14:ligatures w14:val="none"/>
+          </w:rPr>
+          <w:t>microsoft/playwright: Playwright is a framework for Web Testing and Automation. It allows testing Chromium, Firefox and WebKit with a single API. (github.com)</w:t>
         </w:r>
       </w:hyperlink>
     </w:p>
@@ -374,101 +250,16 @@
         </w:rPr>
       </w:pPr>
       <w:hyperlink r:id="rId12" w:history="1">
-        <w:proofErr w:type="spellStart"/>
-        <w:r>
-          <w:rPr>
-            <w:rFonts w:ascii="Calibri" w:eastAsia="Times New Roman" w:hAnsi="Calibri" w:cs="Calibri"/>
-            <w:color w:val="0000FF"/>
-            <w:kern w:val="0"/>
-            <w:u w:val="single"/>
-            <w:lang w:eastAsia="en-GB"/>
-            <w14:ligatures w14:val="none"/>
-          </w:rPr>
-          <w:t>electronicarts</w:t>
-        </w:r>
-        <w:proofErr w:type="spellEnd"/>
-        <w:r>
-          <w:rPr>
-            <w:rFonts w:ascii="Calibri" w:eastAsia="Times New Roman" w:hAnsi="Calibri" w:cs="Calibri"/>
-            <w:color w:val="0000FF"/>
-            <w:kern w:val="0"/>
-            <w:u w:val="single"/>
-            <w:lang w:eastAsia="en-GB"/>
-            <w14:ligatures w14:val="none"/>
-          </w:rPr>
-          <w:t>/</w:t>
-        </w:r>
-        <w:proofErr w:type="spellStart"/>
-        <w:r>
-          <w:rPr>
-            <w:rFonts w:ascii="Calibri" w:eastAsia="Times New Roman" w:hAnsi="Calibri" w:cs="Calibri"/>
-            <w:color w:val="0000FF"/>
-            <w:kern w:val="0"/>
-            <w:u w:val="single"/>
-            <w:lang w:eastAsia="en-GB"/>
-            <w14:ligatures w14:val="none"/>
-          </w:rPr>
-          <w:t>EATest</w:t>
-        </w:r>
-        <w:proofErr w:type="spellEnd"/>
-        <w:r>
-          <w:rPr>
-            <w:rFonts w:ascii="Calibri" w:eastAsia="Times New Roman" w:hAnsi="Calibri" w:cs="Calibri"/>
-            <w:color w:val="0000FF"/>
-            <w:kern w:val="0"/>
-            <w:u w:val="single"/>
-            <w:lang w:eastAsia="en-GB"/>
-            <w14:ligatures w14:val="none"/>
-          </w:rPr>
-          <w:t xml:space="preserve">: </w:t>
-        </w:r>
-        <w:proofErr w:type="spellStart"/>
-        <w:r>
-          <w:rPr>
-            <w:rFonts w:ascii="Calibri" w:eastAsia="Times New Roman" w:hAnsi="Calibri" w:cs="Calibri"/>
-            <w:color w:val="0000FF"/>
-            <w:kern w:val="0"/>
-            <w:u w:val="single"/>
-            <w:lang w:eastAsia="en-GB"/>
-            <w14:ligatures w14:val="none"/>
-          </w:rPr>
-          <w:t>EATest</w:t>
-        </w:r>
-        <w:proofErr w:type="spellEnd"/>
-        <w:r>
-          <w:rPr>
-            <w:rFonts w:ascii="Calibri" w:eastAsia="Times New Roman" w:hAnsi="Calibri" w:cs="Calibri"/>
-            <w:color w:val="0000FF"/>
-            <w:kern w:val="0"/>
-            <w:u w:val="single"/>
-            <w:lang w:eastAsia="en-GB"/>
-            <w14:ligatures w14:val="none"/>
-          </w:rPr>
-          <w:t xml:space="preserve"> is a C++ unit testing framework. </w:t>
-        </w:r>
-        <w:proofErr w:type="gramStart"/>
-        <w:r>
-          <w:rPr>
-            <w:rFonts w:ascii="Calibri" w:eastAsia="Times New Roman" w:hAnsi="Calibri" w:cs="Calibri"/>
-            <w:color w:val="0000FF"/>
-            <w:kern w:val="0"/>
-            <w:u w:val="single"/>
-            <w:lang w:eastAsia="en-GB"/>
-            <w14:ligatures w14:val="none"/>
-          </w:rPr>
-          <w:t>It's</w:t>
-        </w:r>
-        <w:proofErr w:type="gramEnd"/>
-        <w:r>
-          <w:rPr>
-            <w:rFonts w:ascii="Calibri" w:eastAsia="Times New Roman" w:hAnsi="Calibri" w:cs="Calibri"/>
-            <w:color w:val="0000FF"/>
-            <w:kern w:val="0"/>
-            <w:u w:val="single"/>
-            <w:lang w:eastAsia="en-GB"/>
-            <w14:ligatures w14:val="none"/>
-          </w:rPr>
-          <w:t xml:space="preserve"> goal is to have a scalable architecture, have minimal dependencies, and simple usage. (github.com)</w:t>
+        <w:r>
+          <w:rPr>
+            <w:rFonts w:ascii="Calibri" w:eastAsia="Times New Roman" w:hAnsi="Calibri" w:cs="Calibri"/>
+            <w:color w:val="0000FF"/>
+            <w:kern w:val="0"/>
+            <w:u w:val="single"/>
+            <w:lang w:eastAsia="en-GB"/>
+            <w14:ligatures w14:val="none"/>
+          </w:rPr>
+          <w:t>electronicarts/EATest: EATest is a C++ unit testing framework. It's goal is to have a scalable architecture, have minimal dependencies, and simple usage. (github.com)</w:t>
         </w:r>
       </w:hyperlink>
     </w:p>
@@ -526,31 +317,7 @@
             <w:lang w:eastAsia="en-GB"/>
             <w14:ligatures w14:val="none"/>
           </w:rPr>
-          <w:t>Floating-Island/</w:t>
-        </w:r>
-        <w:proofErr w:type="spellStart"/>
-        <w:r>
-          <w:rPr>
-            <w:rFonts w:ascii="Calibri" w:eastAsia="Times New Roman" w:hAnsi="Calibri" w:cs="Calibri"/>
-            <w:color w:val="0000FF"/>
-            <w:kern w:val="0"/>
-            <w:u w:val="single"/>
-            <w:lang w:eastAsia="en-GB"/>
-            <w14:ligatures w14:val="none"/>
-          </w:rPr>
-          <w:t>ProjectR</w:t>
-        </w:r>
-        <w:proofErr w:type="spellEnd"/>
-        <w:r>
-          <w:rPr>
-            <w:rFonts w:ascii="Calibri" w:eastAsia="Times New Roman" w:hAnsi="Calibri" w:cs="Calibri"/>
-            <w:color w:val="0000FF"/>
-            <w:kern w:val="0"/>
-            <w:u w:val="single"/>
-            <w:lang w:eastAsia="en-GB"/>
-            <w14:ligatures w14:val="none"/>
-          </w:rPr>
-          <w:t>: Final Project for the Engineer's Degree (github.com)</w:t>
+          <w:t>Floating-Island/ProjectR: Final Project for the Engineer's Degree (github.com)</w:t>
         </w:r>
       </w:hyperlink>
     </w:p>
@@ -628,29 +395,16 @@
         </w:rPr>
       </w:pPr>
       <w:hyperlink r:id="rId17" w:history="1">
-        <w:proofErr w:type="spellStart"/>
-        <w:r>
-          <w:rPr>
-            <w:rFonts w:ascii="Calibri" w:eastAsia="Times New Roman" w:hAnsi="Calibri" w:cs="Calibri"/>
-            <w:color w:val="0000FF"/>
-            <w:kern w:val="0"/>
-            <w:u w:val="single"/>
-            <w:lang w:eastAsia="en-GB"/>
-            <w14:ligatures w14:val="none"/>
-          </w:rPr>
-          <w:t>Gamesmith</w:t>
-        </w:r>
-        <w:proofErr w:type="spellEnd"/>
-        <w:r>
-          <w:rPr>
-            <w:rFonts w:ascii="Calibri" w:eastAsia="Times New Roman" w:hAnsi="Calibri" w:cs="Calibri"/>
-            <w:color w:val="0000FF"/>
-            <w:kern w:val="0"/>
-            <w:u w:val="single"/>
-            <w:lang w:eastAsia="en-GB"/>
-            <w14:ligatures w14:val="none"/>
-          </w:rPr>
-          <w:t xml:space="preserve"> : Scribble Maps</w:t>
+        <w:r>
+          <w:rPr>
+            <w:rFonts w:ascii="Calibri" w:eastAsia="Times New Roman" w:hAnsi="Calibri" w:cs="Calibri"/>
+            <w:color w:val="0000FF"/>
+            <w:kern w:val="0"/>
+            <w:u w:val="single"/>
+            <w:lang w:eastAsia="en-GB"/>
+            <w14:ligatures w14:val="none"/>
+          </w:rPr>
+          <w:t>Gamesmith : Scribble Maps</w:t>
         </w:r>
       </w:hyperlink>
     </w:p>
@@ -708,55 +462,7 @@
             <w:lang w:eastAsia="en-GB"/>
             <w14:ligatures w14:val="none"/>
           </w:rPr>
-          <w:t xml:space="preserve">Developing with confidence: automated tests in Unity - Patryk </w:t>
-        </w:r>
-        <w:proofErr w:type="spellStart"/>
-        <w:r>
-          <w:rPr>
-            <w:rFonts w:ascii="Calibri" w:eastAsia="Times New Roman" w:hAnsi="Calibri" w:cs="Calibri"/>
-            <w:color w:val="0000FF"/>
-            <w:kern w:val="0"/>
-            <w:u w:val="single"/>
-            <w:lang w:eastAsia="en-GB"/>
-            <w14:ligatures w14:val="none"/>
-          </w:rPr>
-          <w:t>Fijałkowski</w:t>
-        </w:r>
-        <w:proofErr w:type="spellEnd"/>
-        <w:r>
-          <w:rPr>
-            <w:rFonts w:ascii="Calibri" w:eastAsia="Times New Roman" w:hAnsi="Calibri" w:cs="Calibri"/>
-            <w:color w:val="0000FF"/>
-            <w:kern w:val="0"/>
-            <w:u w:val="single"/>
-            <w:lang w:eastAsia="en-GB"/>
-            <w14:ligatures w14:val="none"/>
-          </w:rPr>
-          <w:t xml:space="preserve"> || </w:t>
-        </w:r>
-        <w:proofErr w:type="spellStart"/>
-        <w:r>
-          <w:rPr>
-            <w:rFonts w:ascii="Calibri" w:eastAsia="Times New Roman" w:hAnsi="Calibri" w:cs="Calibri"/>
-            <w:color w:val="0000FF"/>
-            <w:kern w:val="0"/>
-            <w:u w:val="single"/>
-            <w:lang w:eastAsia="en-GB"/>
-            <w14:ligatures w14:val="none"/>
-          </w:rPr>
-          <w:t>GameSwift</w:t>
-        </w:r>
-        <w:proofErr w:type="spellEnd"/>
-        <w:r>
-          <w:rPr>
-            <w:rFonts w:ascii="Calibri" w:eastAsia="Times New Roman" w:hAnsi="Calibri" w:cs="Calibri"/>
-            <w:color w:val="0000FF"/>
-            <w:kern w:val="0"/>
-            <w:u w:val="single"/>
-            <w:lang w:eastAsia="en-GB"/>
-            <w14:ligatures w14:val="none"/>
-          </w:rPr>
-          <w:t xml:space="preserve"> ||</w:t>
+          <w:t>Developing with confidence: automated tests in Unity - Patryk Fijałkowski || GameSwift ||</w:t>
         </w:r>
       </w:hyperlink>
       <w:r>
@@ -769,29 +475,16 @@
         <w:t xml:space="preserve"> / </w:t>
       </w:r>
       <w:hyperlink r:id="rId20" w:history="1">
-        <w:proofErr w:type="spellStart"/>
-        <w:r>
-          <w:rPr>
-            <w:rFonts w:ascii="Calibri" w:eastAsia="Times New Roman" w:hAnsi="Calibri" w:cs="Calibri"/>
-            <w:color w:val="0000FF"/>
-            <w:kern w:val="0"/>
-            <w:u w:val="single"/>
-            <w:lang w:eastAsia="en-GB"/>
-            <w14:ligatures w14:val="none"/>
-          </w:rPr>
-          <w:t>github</w:t>
-        </w:r>
-        <w:proofErr w:type="spellEnd"/>
-        <w:r>
-          <w:rPr>
-            <w:rFonts w:ascii="Calibri" w:eastAsia="Times New Roman" w:hAnsi="Calibri" w:cs="Calibri"/>
-            <w:color w:val="0000FF"/>
-            <w:kern w:val="0"/>
-            <w:u w:val="single"/>
-            <w:lang w:eastAsia="en-GB"/>
-            <w14:ligatures w14:val="none"/>
-          </w:rPr>
-          <w:t xml:space="preserve"> actions - YouTube</w:t>
+        <w:r>
+          <w:rPr>
+            <w:rFonts w:ascii="Calibri" w:eastAsia="Times New Roman" w:hAnsi="Calibri" w:cs="Calibri"/>
+            <w:color w:val="0000FF"/>
+            <w:kern w:val="0"/>
+            <w:u w:val="single"/>
+            <w:lang w:eastAsia="en-GB"/>
+            <w14:ligatures w14:val="none"/>
+          </w:rPr>
+          <w:t>github actions - YouTube</w:t>
         </w:r>
       </w:hyperlink>
     </w:p>
@@ -849,7 +542,6 @@
         </w:rPr>
       </w:pPr>
       <w:hyperlink r:id="rId22" w:history="1">
-        <w:proofErr w:type="spellStart"/>
         <w:r>
           <w:rPr>
             <w:rFonts w:ascii="Calibri" w:eastAsia="Times New Roman" w:hAnsi="Calibri" w:cs="Calibri"/>
@@ -861,7 +553,6 @@
           </w:rPr>
           <w:t>Exercism</w:t>
         </w:r>
-        <w:proofErr w:type="spellEnd"/>
       </w:hyperlink>
     </w:p>
     <w:p>
@@ -909,29 +600,16 @@
         </w:rPr>
       </w:pPr>
       <w:hyperlink r:id="rId24" w:history="1">
-        <w:proofErr w:type="spellStart"/>
-        <w:r>
-          <w:rPr>
-            <w:rFonts w:ascii="Calibri" w:eastAsia="Times New Roman" w:hAnsi="Calibri" w:cs="Calibri"/>
-            <w:color w:val="0000FF"/>
-            <w:kern w:val="0"/>
-            <w:u w:val="single"/>
-            <w:lang w:eastAsia="en-GB"/>
-            <w14:ligatures w14:val="none"/>
-          </w:rPr>
-          <w:t>Codewars</w:t>
-        </w:r>
-        <w:proofErr w:type="spellEnd"/>
-        <w:r>
-          <w:rPr>
-            <w:rFonts w:ascii="Calibri" w:eastAsia="Times New Roman" w:hAnsi="Calibri" w:cs="Calibri"/>
-            <w:color w:val="0000FF"/>
-            <w:kern w:val="0"/>
-            <w:u w:val="single"/>
-            <w:lang w:eastAsia="en-GB"/>
-            <w14:ligatures w14:val="none"/>
-          </w:rPr>
-          <w:t xml:space="preserve"> - Achieve mastery through coding practice and developer mentorship</w:t>
+        <w:r>
+          <w:rPr>
+            <w:rFonts w:ascii="Calibri" w:eastAsia="Times New Roman" w:hAnsi="Calibri" w:cs="Calibri"/>
+            <w:color w:val="0000FF"/>
+            <w:kern w:val="0"/>
+            <w:u w:val="single"/>
+            <w:lang w:eastAsia="en-GB"/>
+            <w14:ligatures w14:val="none"/>
+          </w:rPr>
+          <w:t>Codewars - Achieve mastery through coding practice and developer mentorship</w:t>
         </w:r>
       </w:hyperlink>
     </w:p>
@@ -960,55 +638,7 @@
             <w:lang w:eastAsia="en-GB"/>
             <w14:ligatures w14:val="none"/>
           </w:rPr>
-          <w:t>C-Sharp-Exercises/</w:t>
-        </w:r>
-        <w:proofErr w:type="spellStart"/>
-        <w:r>
-          <w:rPr>
-            <w:rFonts w:ascii="Calibri" w:eastAsia="Times New Roman" w:hAnsi="Calibri" w:cs="Calibri"/>
-            <w:color w:val="0000FF"/>
-            <w:kern w:val="0"/>
-            <w:u w:val="single"/>
-            <w:lang w:eastAsia="en-GB"/>
-            <w14:ligatures w14:val="none"/>
-          </w:rPr>
-          <w:t>Exercises.cs</w:t>
-        </w:r>
-        <w:proofErr w:type="spellEnd"/>
-        <w:r>
-          <w:rPr>
-            <w:rFonts w:ascii="Calibri" w:eastAsia="Times New Roman" w:hAnsi="Calibri" w:cs="Calibri"/>
-            <w:color w:val="0000FF"/>
-            <w:kern w:val="0"/>
-            <w:u w:val="single"/>
-            <w:lang w:eastAsia="en-GB"/>
-            <w14:ligatures w14:val="none"/>
-          </w:rPr>
-          <w:t xml:space="preserve"> at master · </w:t>
-        </w:r>
-        <w:proofErr w:type="spellStart"/>
-        <w:r>
-          <w:rPr>
-            <w:rFonts w:ascii="Calibri" w:eastAsia="Times New Roman" w:hAnsi="Calibri" w:cs="Calibri"/>
-            <w:color w:val="0000FF"/>
-            <w:kern w:val="0"/>
-            <w:u w:val="single"/>
-            <w:lang w:eastAsia="en-GB"/>
-            <w14:ligatures w14:val="none"/>
-          </w:rPr>
-          <w:t>Ishamoridin</w:t>
-        </w:r>
-        <w:proofErr w:type="spellEnd"/>
-        <w:r>
-          <w:rPr>
-            <w:rFonts w:ascii="Calibri" w:eastAsia="Times New Roman" w:hAnsi="Calibri" w:cs="Calibri"/>
-            <w:color w:val="0000FF"/>
-            <w:kern w:val="0"/>
-            <w:u w:val="single"/>
-            <w:lang w:eastAsia="en-GB"/>
-            <w14:ligatures w14:val="none"/>
-          </w:rPr>
-          <w:t>/C-Sharp-Exercises (github.com)</w:t>
+          <w:t>C-Sharp-Exercises/Exercises.cs at master · Ishamoridin/C-Sharp-Exercises (github.com)</w:t>
         </w:r>
       </w:hyperlink>
     </w:p>
@@ -1028,43 +658,17 @@
         </w:rPr>
       </w:pPr>
       <w:hyperlink r:id="rId26" w:anchor="designing-bdd-scenarios-in-testrail-0-0" w:history="1">
-        <w:proofErr w:type="spellStart"/>
-        <w:r>
-          <w:rPr>
-            <w:rFonts w:ascii="Calibri" w:eastAsia="Times New Roman" w:hAnsi="Calibri" w:cs="Calibri"/>
-            <w:color w:val="0000FF"/>
-            <w:kern w:val="0"/>
-            <w:u w:val="single"/>
-            <w:lang w:eastAsia="en-GB"/>
-            <w14:ligatures w14:val="none"/>
-          </w:rPr>
-          <w:t>Behavior</w:t>
-        </w:r>
-        <w:proofErr w:type="spellEnd"/>
-        <w:r>
-          <w:rPr>
-            <w:rFonts w:ascii="Calibri" w:eastAsia="Times New Roman" w:hAnsi="Calibri" w:cs="Calibri"/>
-            <w:color w:val="0000FF"/>
-            <w:kern w:val="0"/>
-            <w:u w:val="single"/>
-            <w:lang w:eastAsia="en-GB"/>
-            <w14:ligatures w14:val="none"/>
-          </w:rPr>
-          <w:t xml:space="preserve">-Driven Development (BDD) – TestRail Support </w:t>
-        </w:r>
-        <w:proofErr w:type="spellStart"/>
-        <w:r>
-          <w:rPr>
-            <w:rFonts w:ascii="Calibri" w:eastAsia="Times New Roman" w:hAnsi="Calibri" w:cs="Calibri"/>
-            <w:color w:val="0000FF"/>
-            <w:kern w:val="0"/>
-            <w:u w:val="single"/>
-            <w:lang w:eastAsia="en-GB"/>
-            <w14:ligatures w14:val="none"/>
-          </w:rPr>
-          <w:t>Center</w:t>
-        </w:r>
-        <w:proofErr w:type="spellEnd"/>
+        <w:r>
+          <w:rPr>
+            <w:rFonts w:ascii="Calibri" w:eastAsia="Times New Roman" w:hAnsi="Calibri" w:cs="Calibri"/>
+            <w:color w:val="0000FF"/>
+            <w:kern w:val="0"/>
+            <w:u w:val="single"/>
+            <w:lang w:eastAsia="en-GB"/>
+            <w14:ligatures w14:val="none"/>
+          </w:rPr>
+          <w:t>Behavior-Driven Development (BDD) – TestRail Support Center</w:t>
+        </w:r>
       </w:hyperlink>
     </w:p>
     <w:p>
@@ -1121,69 +725,8 @@
             <w:lang w:eastAsia="en-GB"/>
             <w14:ligatures w14:val="none"/>
           </w:rPr>
-          <w:t xml:space="preserve">How we create (real) </w:t>
-        </w:r>
-        <w:proofErr w:type="spellStart"/>
-        <w:r>
-          <w:rPr>
-            <w:rFonts w:ascii="Calibri" w:eastAsia="Times New Roman" w:hAnsi="Calibri" w:cs="Calibri"/>
-            <w:color w:val="0000FF"/>
-            <w:kern w:val="0"/>
-            <w:u w:val="single"/>
-            <w:lang w:eastAsia="en-GB"/>
-            <w14:ligatures w14:val="none"/>
-          </w:rPr>
-          <w:t>UnitTests</w:t>
-        </w:r>
-        <w:proofErr w:type="spellEnd"/>
-        <w:r>
-          <w:rPr>
-            <w:rFonts w:ascii="Calibri" w:eastAsia="Times New Roman" w:hAnsi="Calibri" w:cs="Calibri"/>
-            <w:color w:val="0000FF"/>
-            <w:kern w:val="0"/>
-            <w:u w:val="single"/>
-            <w:lang w:eastAsia="en-GB"/>
-            <w14:ligatures w14:val="none"/>
-          </w:rPr>
-          <w:t xml:space="preserve"> for Unreal Engine with </w:t>
-        </w:r>
-        <w:proofErr w:type="spellStart"/>
-        <w:r>
-          <w:rPr>
-            <w:rFonts w:ascii="Calibri" w:eastAsia="Times New Roman" w:hAnsi="Calibri" w:cs="Calibri"/>
-            <w:color w:val="0000FF"/>
-            <w:kern w:val="0"/>
-            <w:u w:val="single"/>
-            <w:lang w:eastAsia="en-GB"/>
-            <w14:ligatures w14:val="none"/>
-          </w:rPr>
-          <w:t>GoogleMock</w:t>
-        </w:r>
-        <w:proofErr w:type="spellEnd"/>
-        <w:r>
-          <w:rPr>
-            <w:rFonts w:ascii="Calibri" w:eastAsia="Times New Roman" w:hAnsi="Calibri" w:cs="Calibri"/>
-            <w:color w:val="0000FF"/>
-            <w:kern w:val="0"/>
-            <w:u w:val="single"/>
-            <w:lang w:eastAsia="en-GB"/>
-            <w14:ligatures w14:val="none"/>
-          </w:rPr>
-          <w:t xml:space="preserve"> | </w:t>
-        </w:r>
-        <w:proofErr w:type="spellStart"/>
-        <w:r>
-          <w:rPr>
-            <w:rFonts w:ascii="Calibri" w:eastAsia="Times New Roman" w:hAnsi="Calibri" w:cs="Calibri"/>
-            <w:color w:val="0000FF"/>
-            <w:kern w:val="0"/>
-            <w:u w:val="single"/>
-            <w:lang w:eastAsia="en-GB"/>
-            <w14:ligatures w14:val="none"/>
-          </w:rPr>
-          <w:t>MaibornWolff</w:t>
-        </w:r>
-        <w:proofErr w:type="spellEnd"/>
+          <w:t>How we create (real) UnitTests for Unreal Engine with GoogleMock | MaibornWolff</w:t>
+        </w:r>
       </w:hyperlink>
     </w:p>
     <w:p>
@@ -1211,31 +754,7 @@
             <w:lang w:eastAsia="en-GB"/>
             <w14:ligatures w14:val="none"/>
           </w:rPr>
-          <w:t>Halo: MCC Creator Hub | Halo - Official Site (</w:t>
-        </w:r>
-        <w:proofErr w:type="spellStart"/>
-        <w:r>
-          <w:rPr>
-            <w:rFonts w:ascii="Calibri" w:eastAsia="Times New Roman" w:hAnsi="Calibri" w:cs="Calibri"/>
-            <w:color w:val="0000FF"/>
-            <w:kern w:val="0"/>
-            <w:u w:val="single"/>
-            <w:lang w:eastAsia="en-GB"/>
-            <w14:ligatures w14:val="none"/>
-          </w:rPr>
-          <w:t>en</w:t>
-        </w:r>
-        <w:proofErr w:type="spellEnd"/>
-        <w:r>
-          <w:rPr>
-            <w:rFonts w:ascii="Calibri" w:eastAsia="Times New Roman" w:hAnsi="Calibri" w:cs="Calibri"/>
-            <w:color w:val="0000FF"/>
-            <w:kern w:val="0"/>
-            <w:u w:val="single"/>
-            <w:lang w:eastAsia="en-GB"/>
-            <w14:ligatures w14:val="none"/>
-          </w:rPr>
-          <w:t>) (halowaypoint.com)</w:t>
+          <w:t>Halo: MCC Creator Hub | Halo - Official Site (en) (halowaypoint.com)</w:t>
         </w:r>
       </w:hyperlink>
     </w:p>
@@ -1293,31 +812,7 @@
             <w:lang w:eastAsia="en-GB"/>
             <w14:ligatures w14:val="none"/>
           </w:rPr>
-          <w:t xml:space="preserve">Tools | Test automation tools for Unity apps and games - </w:t>
-        </w:r>
-        <w:proofErr w:type="spellStart"/>
-        <w:r>
-          <w:rPr>
-            <w:rFonts w:ascii="Calibri" w:eastAsia="Times New Roman" w:hAnsi="Calibri" w:cs="Calibri"/>
-            <w:color w:val="0000FF"/>
-            <w:kern w:val="0"/>
-            <w:u w:val="single"/>
-            <w:lang w:eastAsia="en-GB"/>
-            <w14:ligatures w14:val="none"/>
-          </w:rPr>
-          <w:t>AltTester</w:t>
-        </w:r>
-        <w:proofErr w:type="spellEnd"/>
-        <w:r>
-          <w:rPr>
-            <w:rFonts w:ascii="Calibri" w:eastAsia="Times New Roman" w:hAnsi="Calibri" w:cs="Calibri"/>
-            <w:color w:val="0000FF"/>
-            <w:kern w:val="0"/>
-            <w:u w:val="single"/>
-            <w:lang w:eastAsia="en-GB"/>
-            <w14:ligatures w14:val="none"/>
-          </w:rPr>
-          <w:t>®</w:t>
+          <w:t>Tools | Test automation tools for Unity apps and games - AltTester®</w:t>
         </w:r>
       </w:hyperlink>
     </w:p>
@@ -1466,79 +961,219 @@
           <w:rPr>
             <w:rStyle w:val="Hyperlink"/>
           </w:rPr>
-          <w:t xml:space="preserve">Mobile Game Tester - Yodo1 | </w:t>
-        </w:r>
-        <w:proofErr w:type="spellStart"/>
+          <w:t>Mobile Game Tester - Yodo1 | Hitmarker</w:t>
+        </w:r>
+      </w:hyperlink>
+    </w:p>
+    <w:p>
+      <w:pPr>
+        <w:numPr>
+          <w:ilvl w:val="0"/>
+          <w:numId w:val="1"/>
+        </w:numPr>
+        <w:spacing w:after="0" w:line="240" w:lineRule="auto"/>
+        <w:textAlignment w:val="center"/>
+        <w:rPr>
+          <w:rFonts w:ascii="Calibri" w:eastAsia="Times New Roman" w:hAnsi="Calibri" w:cs="Calibri"/>
+          <w:kern w:val="0"/>
+          <w:lang w:eastAsia="en-GB"/>
+          <w14:ligatures w14:val="none"/>
+        </w:rPr>
+      </w:pPr>
+      <w:hyperlink r:id="rId37" w:history="1">
         <w:r>
           <w:rPr>
             <w:rStyle w:val="Hyperlink"/>
           </w:rPr>
-          <w:t>Hitmarker</w:t>
-        </w:r>
-        <w:proofErr w:type="spellEnd"/>
-      </w:hyperlink>
-    </w:p>
-    <w:p>
-      <w:pPr>
-        <w:numPr>
-          <w:ilvl w:val="0"/>
-          <w:numId w:val="1"/>
-        </w:numPr>
-        <w:spacing w:after="0" w:line="240" w:lineRule="auto"/>
-        <w:textAlignment w:val="center"/>
-        <w:rPr>
-          <w:rFonts w:ascii="Calibri" w:eastAsia="Times New Roman" w:hAnsi="Calibri" w:cs="Calibri"/>
-          <w:kern w:val="0"/>
-          <w:lang w:eastAsia="en-GB"/>
-          <w14:ligatures w14:val="none"/>
-        </w:rPr>
-      </w:pPr>
-      <w:hyperlink r:id="rId37" w:history="1">
-        <w:proofErr w:type="spellStart"/>
+          <w:t>AutoplayAutomation/Autoplay_Samples (github.com)</w:t>
+        </w:r>
+      </w:hyperlink>
+    </w:p>
+    <w:p>
+      <w:pPr>
+        <w:numPr>
+          <w:ilvl w:val="0"/>
+          <w:numId w:val="1"/>
+        </w:numPr>
+        <w:spacing w:after="0" w:line="240" w:lineRule="auto"/>
+        <w:textAlignment w:val="center"/>
+        <w:rPr>
+          <w:rStyle w:val="Hyperlink"/>
+          <w:rFonts w:ascii="Calibri" w:eastAsia="Times New Roman" w:hAnsi="Calibri" w:cs="Calibri"/>
+          <w:color w:val="auto"/>
+          <w:kern w:val="0"/>
+          <w:u w:val="none"/>
+          <w:lang w:eastAsia="en-GB"/>
+          <w14:ligatures w14:val="none"/>
+        </w:rPr>
+      </w:pPr>
+      <w:hyperlink r:id="rId38" w:history="1">
         <w:r>
           <w:rPr>
             <w:rStyle w:val="Hyperlink"/>
           </w:rPr>
-          <w:t>AutoplayAutomation</w:t>
-        </w:r>
-        <w:proofErr w:type="spellEnd"/>
+          <w:t>StudioGobo/UECollisionQueryTools: The collision query tools mentioned in the UnrealFest 23 talk Making Sense Of Collision Data (github.com)</w:t>
+        </w:r>
+      </w:hyperlink>
+    </w:p>
+    <w:p>
+      <w:pPr>
+        <w:numPr>
+          <w:ilvl w:val="0"/>
+          <w:numId w:val="1"/>
+        </w:numPr>
+        <w:spacing w:after="0" w:line="240" w:lineRule="auto"/>
+        <w:textAlignment w:val="center"/>
+        <w:rPr>
+          <w:rStyle w:val="Hyperlink"/>
+          <w:rFonts w:ascii="Calibri" w:eastAsia="Times New Roman" w:hAnsi="Calibri" w:cs="Calibri"/>
+          <w:color w:val="auto"/>
+          <w:kern w:val="0"/>
+          <w:u w:val="none"/>
+          <w:lang w:eastAsia="en-GB"/>
+          <w14:ligatures w14:val="none"/>
+        </w:rPr>
+      </w:pPr>
+      <w:hyperlink r:id="rId39" w:history="1">
         <w:r>
           <w:rPr>
             <w:rStyle w:val="Hyperlink"/>
           </w:rPr>
-          <w:t>/</w:t>
-        </w:r>
-        <w:proofErr w:type="spellStart"/>
+          <w:t>Redpoint Games / Unreal Engine Tool · GitLab</w:t>
+        </w:r>
+      </w:hyperlink>
+    </w:p>
+    <w:p>
+      <w:pPr>
+        <w:numPr>
+          <w:ilvl w:val="0"/>
+          <w:numId w:val="1"/>
+        </w:numPr>
+        <w:spacing w:after="0" w:line="240" w:lineRule="auto"/>
+        <w:textAlignment w:val="center"/>
+        <w:rPr>
+          <w:rStyle w:val="Hyperlink"/>
+          <w:rFonts w:ascii="Calibri" w:eastAsia="Times New Roman" w:hAnsi="Calibri" w:cs="Calibri"/>
+          <w:color w:val="auto"/>
+          <w:kern w:val="0"/>
+          <w:u w:val="none"/>
+          <w:lang w:eastAsia="en-GB"/>
+          <w14:ligatures w14:val="none"/>
+        </w:rPr>
+      </w:pPr>
+      <w:hyperlink r:id="rId40" w:history="1">
         <w:r>
           <w:rPr>
             <w:rStyle w:val="Hyperlink"/>
           </w:rPr>
-          <w:t>Autoplay_Samples</w:t>
-        </w:r>
-        <w:proofErr w:type="spellEnd"/>
+          <w:t>ChibaChaba by PabloErizo (itch.io)</w:t>
+        </w:r>
+      </w:hyperlink>
+    </w:p>
+    <w:p>
+      <w:pPr>
+        <w:numPr>
+          <w:ilvl w:val="0"/>
+          <w:numId w:val="1"/>
+        </w:numPr>
+        <w:spacing w:after="0" w:line="240" w:lineRule="auto"/>
+        <w:textAlignment w:val="center"/>
+        <w:rPr>
+          <w:rFonts w:ascii="Calibri" w:eastAsia="Times New Roman" w:hAnsi="Calibri" w:cs="Calibri"/>
+          <w:kern w:val="0"/>
+          <w:lang w:eastAsia="en-GB"/>
+          <w14:ligatures w14:val="none"/>
+        </w:rPr>
+      </w:pPr>
+      <w:hyperlink r:id="rId41" w:history="1">
         <w:r>
           <w:rPr>
             <w:rStyle w:val="Hyperlink"/>
           </w:rPr>
-          <w:t xml:space="preserve"> (github.com)</w:t>
-        </w:r>
-      </w:hyperlink>
-    </w:p>
-    <w:p>
-      <w:pPr>
-        <w:numPr>
-          <w:ilvl w:val="0"/>
-          <w:numId w:val="1"/>
-        </w:numPr>
-        <w:spacing w:after="0" w:line="240" w:lineRule="auto"/>
-        <w:textAlignment w:val="center"/>
-        <w:rPr>
-          <w:rFonts w:ascii="Calibri" w:eastAsia="Times New Roman" w:hAnsi="Calibri" w:cs="Calibri"/>
-          <w:kern w:val="0"/>
-          <w:lang w:eastAsia="en-GB"/>
-          <w14:ligatures w14:val="none"/>
-        </w:rPr>
-      </w:pPr>
+          <w:t>ArabicProjectClean/Source/ChibaChaba/Private/Tests/Test_UMG.cpp at main · PablushaRubeCube/ArabicProjectClean (github.com)</w:t>
+        </w:r>
+      </w:hyperlink>
+      <w:r>
+        <w:t xml:space="preserve"> ^</w:t>
+      </w:r>
+    </w:p>
+    <w:p>
+      <w:pPr>
+        <w:numPr>
+          <w:ilvl w:val="0"/>
+          <w:numId w:val="1"/>
+        </w:numPr>
+        <w:spacing w:after="0" w:line="240" w:lineRule="auto"/>
+        <w:textAlignment w:val="center"/>
+        <w:rPr>
+          <w:rFonts w:ascii="Calibri" w:eastAsia="Times New Roman" w:hAnsi="Calibri" w:cs="Calibri"/>
+          <w:kern w:val="0"/>
+          <w:lang w:eastAsia="en-GB"/>
+          <w14:ligatures w14:val="none"/>
+        </w:rPr>
+      </w:pPr>
+      <w:hyperlink r:id="rId42" w:history="1">
+        <w:r>
+          <w:rPr>
+            <w:rStyle w:val="Hyperlink"/>
+          </w:rPr>
+          <w:t>Game Testing (istqb.org)</w:t>
+        </w:r>
+      </w:hyperlink>
+      <w:r>
+        <w:t xml:space="preserve"> – certificates</w:t>
+      </w:r>
+    </w:p>
+    <w:p>
+      <w:pPr>
+        <w:numPr>
+          <w:ilvl w:val="0"/>
+          <w:numId w:val="1"/>
+        </w:numPr>
+        <w:spacing w:after="0" w:line="240" w:lineRule="auto"/>
+        <w:textAlignment w:val="center"/>
+        <w:rPr>
+          <w:rFonts w:ascii="Calibri" w:eastAsia="Times New Roman" w:hAnsi="Calibri" w:cs="Calibri"/>
+          <w:kern w:val="0"/>
+          <w:lang w:eastAsia="en-GB"/>
+          <w14:ligatures w14:val="none"/>
+        </w:rPr>
+      </w:pPr>
+      <w:hyperlink r:id="rId43" w:history="1">
+        <w:r>
+          <w:rPr>
+            <w:rStyle w:val="Hyperlink"/>
+          </w:rPr>
+          <w:t>Automating Unreal Engine project builds for Steam using GitHub | by Douglas Lassance | Medium</w:t>
+        </w:r>
+      </w:hyperlink>
+    </w:p>
+    <w:p>
+      <w:pPr>
+        <w:numPr>
+          <w:ilvl w:val="0"/>
+          <w:numId w:val="1"/>
+        </w:numPr>
+        <w:spacing w:after="0" w:line="240" w:lineRule="auto"/>
+        <w:textAlignment w:val="center"/>
+        <w:rPr>
+          <w:rFonts w:ascii="Calibri" w:eastAsia="Times New Roman" w:hAnsi="Calibri" w:cs="Calibri"/>
+          <w:kern w:val="0"/>
+          <w:lang w:eastAsia="en-GB"/>
+          <w14:ligatures w14:val="none"/>
+        </w:rPr>
+      </w:pPr>
+      <w:hyperlink r:id="rId44" w:history="1">
+        <w:r>
+          <w:rPr>
+            <w:rStyle w:val="Hyperlink"/>
+          </w:rPr>
+          <w:t>UE4 Automation Testing | Squareys' Blog</w:t>
+        </w:r>
+      </w:hyperlink>
+      <w:r>
+        <w:t xml:space="preserve"> – creating a plugin</w:t>
+      </w:r>
     </w:p>
     <w:p/>
     <w:sectPr>

</xml_diff>